<commit_message>
WHSOP_003 / QASOP_0XX: take QC sample transport out of scope (PP-QC-SOP-025)
Transport of QC samples to external laboratories is a separate SOP,
PP-QC-SOP-025. WHSOP_003 had folded it in from QMS-LOG-SOP-003, which is
that sample SOP's predecessor, not the euphoric-substance SOP.

- WHSOP_003: samples removed from purpose, scope, RACI, condition matrix,
  procedure and records; added as an exclusion and related document.
- Request for Analysis annex removed; A07 -> A06 (MoH report),
  A08 -> A07 (QA review); checklist and review rows renumbered.
- QASOP_0XX: laboratory lanes L01-L04 removed from the register (L05-L07
  -> L01-L03); sample range and laboratory scope removed; exclusion added.

Co-Authored-By: Claude Opus 5.5 <noreply@anthropic.com>
Claude-Session: https://claude.ai/code/session_01Fszd7nMMPhqDmBiyiM2Bec
</commit_message>
<xml_diff>
--- a/deliverables/inland_transport_2026-10/docx/QASOP_0XX.docx
+++ b/deliverables/inland_transport_2026-10/docx/QASOP_0XX.docx
@@ -897,7 +897,7 @@
                 <w:color w:val="000000"/>
                 <w:sz w:val="22"/>
               </w:rPr>
-              <w:t>Оваа СОП се применува на: (а) возилата на договорната обезбедувачка компанија (температурно контролиран товарен простор) што се користат за WHSOP_003; (б) транспортните контејнери и пасивните ладилници (квалифицирани пакувања); (в) рутите од локацијата Којлија 1043, Петровец, до сите домашни примачи и лаборатории; и (г) логерите за температура и влага што се користат за мапирање и рутинско следење.</w:t>
+              <w:t>Оваа СОП се применува на: (а) возилата на договорната обезбедувачка компанија (температурно контролиран товарен простор) што се користат за WHSOP_003; (б) транспортните контејнери и пасивните ладилници (квалифицирани пакувања); (в) рутите од локацијата Којлија 1043, Петровец, до сите домашни примачи според WHSOP_003; и (г) логерите за температура и влага што се користат за мапирање и рутинско следење.</w:t>
             </w:r>
           </w:p>
         </w:tc>
@@ -925,7 +925,7 @@
                 <w:color w:val="595959"/>
                 <w:sz w:val="22"/>
               </w:rPr>
-              <w:t>This SOP applies to: (a) the vehicles of the contracted security company (temperature-controlled load space) used under WHSOP_003; (b) the transport containers and passive cool boxes (qualified packaging); (c) the lanes from the Kojlija 1043, Petrovec site to all domestic consignees and laboratories; and (d) the temperature and humidity loggers used for mapping and routine monitoring.</w:t>
+              <w:t>This SOP applies to: (a) the vehicles of the contracted security company (temperature-controlled load space) used under WHSOP_003; (b) the transport containers and passive cool boxes (qualified packaging); (c) the lanes from the Kojlija 1043, Petrovec site to all domestic consignees under WHSOP_003; and (d) the temperature and humidity loggers used for mapping and routine monitoring.</w:t>
             </w:r>
           </w:p>
         </w:tc>
@@ -1008,7 +1008,7 @@
                 <w:color w:val="000000"/>
                 <w:sz w:val="22"/>
               </w:rPr>
-              <w:t>Не ги опфаќа: валидацијата на увозни и извозни (авио) рути според WHSOP_002 — која се изведува со истата методологија во посебен протокол; квалификацијата на складишта и простории (QAS-03-003); и валидацијата на компјутерски системи за GPS/логери (QAS-03-002).</w:t>
+              <w:t>Не ги опфаќа: валидацијата на увозни и извозни (авио) рути според WHSOP_002 — која се изведува со истата методологија во посебен протокол; транспортот на мостри за контрола на квалитет до надворешни лаборатории, кој е предмет на PP-QC-SOP-025; квалификацијата на складишта и простории (QAS-03-003); и валидацијата на компјутерски системи за GPS/логери (QAS-03-002).</w:t>
             </w:r>
           </w:p>
         </w:tc>
@@ -1036,7 +1036,7 @@
                 <w:color w:val="595959"/>
                 <w:sz w:val="22"/>
               </w:rPr>
-              <w:t>It does not cover: validation of import and export (air) lanes per WHSOP_002 — performed with the same methodology in a separate protocol; qualification of warehouses and premises (QAS-03-003); and validation of GPS/logger computer systems (QAS-03-002).</w:t>
+              <w:t>It does not cover: validation of import and export (air) lanes per WHSOP_002 — performed with the same methodology in a separate protocol; the transport of quality-control samples to external laboratories, which is the subject of PP-QC-SOP-025; qualification of warehouses and premises (QAS-03-003); and validation of GPS/logger computer systems (QAS-03-002).</w:t>
             </w:r>
           </w:p>
         </w:tc>

</xml_diff>

<commit_message>
Transport sets: contracted licensed carrier; active/passive cooling as a checkbox
- carrier (licensed transport company) provides vehicle and driver under
  MoIA police escort; Purely Plant accompanying person optional per TRA
- carrier qualification (QAS-10-003) and Quality Agreement; EU GMP and GDP
  Chapter 7 (outsourced activities) cited; carrier field on TRA, MoIA
  request, manifest, MoH report; carrier check added to checklist (A5)
  and QA review (row 3); carrier trains its drivers per the agreement
- temperature control is an Active / Passive checkbox on the TRA,
  manifest, checklist, OQ/PQ records, protocol and report, so one set of
  forms serves either vehicle
- QASOP_0XX: carrier responsibilities, change of carrier as a
  requalification trigger

Co-Authored-By: Claude Opus 5.5 <noreply@anthropic.com>
Claude-Session: https://claude.ai/code/session_01Fszd7nMMPhqDmBiyiM2Bec
</commit_message>
<xml_diff>
--- a/deliverables/inland_transport_2026-10/docx/QASOP_0XX.docx
+++ b/deliverables/inland_transport_2026-10/docx/QASOP_0XX.docx
@@ -961,7 +961,7 @@
                 <w:color w:val="000000"/>
                 <w:sz w:val="22"/>
               </w:rPr>
-              <w:t>Оваа СОП се применува на: (а) транспортните возила (камиони) што се користат според WHSOP_003, со или без активна контрола на температура; (б) конфигурацијата на пакување: картон со 10 кеси, голема палета (8 картони) и мала палета (4 картони) на евро-палета, завиткани со стреч-фолија и термо-ќебе, како и квалификуваните ладилници; (в) рутите од локацијата Којлија 1043, Петровец, до сите домашни примачи според WHSOP_003; и (г) логерите: USB логерите за температура и влага (мапирање) и логерите за еднократна употреба (во палетите).</w:t>
+              <w:t>Оваа СОП се применува на: (а) транспортните возила (камиони) на договорениот превозник што се користат според WHSOP_003, со или без активна контрола на температура; (б) конфигурацијата на пакување: картон со 10 кеси, голема палета (8 картони) и мала палета (4 картони) на евро-палета, завиткани со стреч-фолија и термо-ќебе, како и квалификуваните ладилници; (в) рутите од локацијата Којлија 1043, Петровец, до сите домашни примачи според WHSOP_003; и (г) логерите: USB логерите за температура и влага (мапирање) и логерите за еднократна употреба (во палетите).</w:t>
             </w:r>
           </w:p>
         </w:tc>
@@ -989,7 +989,7 @@
                 <w:color w:val="595959"/>
                 <w:sz w:val="22"/>
               </w:rPr>
-              <w:t>This SOP applies to: (a) the transport vehicles (trucks) used under WHSOP_003, with or without active temperature control; (b) the packaging configuration: a carton of 10 bags, a large pallet (8 cartons) and a small pallet (4 cartons) on a Euro pallet, wrapped in stretch film and a thermal blanket, as well as the qualified cool boxes; (c) the lanes from the Kojlija 1043, Petrovec site to all domestic consignees under WHSOP_003; and (d) the loggers: the USB temperature and humidity loggers (mapping) and the single-use loggers (in the pallets).</w:t>
+              <w:t>This SOP applies to: (a) the transport vehicles (trucks) of the contracted carrier used under WHSOP_003, with or without active temperature control; (b) the packaging configuration: a carton of 10 bags, a large pallet (8 cartons) and a small pallet (4 cartons) on a Euro pallet, wrapped in stretch film and a thermal blanket, as well as the qualified cool boxes; (c) the lanes from the Kojlija 1043, Petrovec site to all domestic consignees under WHSOP_003; and (d) the loggers: the USB temperature and humidity loggers (mapping) and the single-use loggers (in the pallets).</w:t>
             </w:r>
           </w:p>
         </w:tc>
@@ -1476,7 +1476,7 @@
                 <w:color w:val="000000"/>
                 <w:sz w:val="22"/>
               </w:rPr>
-              <w:t>Техничко одржување: ги одржува и калибрира USB логерите (сертификат следлив до национални/меѓународни еталони, неодреденост ≤ ±0,5 °C и ≤ ±3 % RH), ги конфигурира и ја спроведува верификацијата на софтверот; ја доставува техничката документација за возилото и (ако постои) уредот за контрола на температура.</w:t>
+              <w:t>Техничко одржување: ги одржува и калибрира USB логерите (сертификат следлив до национални/меѓународни еталони, неодреденост ≤ ±0,5 °C и ≤ ±3 % RH), ги конфигурира и ја спроведува верификацијата на софтверот.</w:t>
             </w:r>
           </w:p>
         </w:tc>
@@ -1504,7 +1504,65 @@
                 <w:color w:val="595959"/>
                 <w:sz w:val="22"/>
               </w:rPr>
-              <w:t>Technical Maintenance: maintains and calibrates the USB loggers (certificate traceable to national/international standards, uncertainty ≤ ±0.5 °C and ≤ ±3 % RH), configures them and performs the software verification; provides the technical documentation of the vehicle and (if fitted) the temperature-control unit.</w:t>
+              <w:t>Technical Maintenance: maintains and calibrates the USB loggers (certificate traceable to national/international standards, uncertainty ≤ ±0.5 °C and ≤ ±3 % RH), configures them and performs the software verification.</w:t>
+            </w:r>
+          </w:p>
+        </w:tc>
+      </w:tr>
+      <w:tr>
+        <w:tc>
+          <w:tcPr>
+            <w:tcW w:type="dxa" w:w="5102"/>
+            <w:tcBorders>
+              <w:top w:val="nil"/>
+              <w:left w:val="nil"/>
+              <w:bottom w:val="nil"/>
+              <w:right w:val="single" w:sz="4" w:color="000000"/>
+            </w:tcBorders>
+          </w:tcPr>
+          <w:p>
+            <w:pPr>
+              <w:spacing w:before="0" w:after="120"/>
+              <w:jc w:val="both"/>
+            </w:pPr>
+            <w:r/>
+            <w:r>
+              <w:rPr>
+                <w:rFonts w:ascii="Calibri" w:hAnsi="Calibri"/>
+                <w:b w:val="0"/>
+                <w:i w:val="0"/>
+                <w:color w:val="000000"/>
+                <w:sz w:val="22"/>
+              </w:rPr>
+              <w:t>Договорен превозник: според Договорот за квалитет, го става на располагање возилото и возачот за OQ и PQ, ја доставува техничката документација за возилото и (ако постои) за уредот за контрола на температура со неговата калибрација, и известува однапред за секоја промена на возилото или опремата.</w:t>
+            </w:r>
+          </w:p>
+        </w:tc>
+        <w:tc>
+          <w:tcPr>
+            <w:tcW w:type="dxa" w:w="5102"/>
+            <w:tcBorders>
+              <w:top w:val="nil"/>
+              <w:left w:val="single" w:sz="4" w:color="000000"/>
+              <w:bottom w:val="nil"/>
+              <w:right w:val="nil"/>
+            </w:tcBorders>
+          </w:tcPr>
+          <w:p>
+            <w:pPr>
+              <w:spacing w:before="0" w:after="120"/>
+              <w:jc w:val="both"/>
+            </w:pPr>
+            <w:r/>
+            <w:r>
+              <w:rPr>
+                <w:rFonts w:ascii="Calibri" w:hAnsi="Calibri"/>
+                <w:b w:val="0"/>
+                <w:i w:val="0"/>
+                <w:color w:val="595959"/>
+                <w:sz w:val="22"/>
+              </w:rPr>
+              <w:t>Contracted carrier: per the Quality Agreement, makes the vehicle and driver available for OQ and PQ, provides the technical documentation of the vehicle and (if fitted) of the temperature-control unit with its calibration, and gives advance notice of any change of vehicle or equipment.</w:t>
             </w:r>
           </w:p>
         </w:tc>
@@ -1871,7 +1929,7 @@
                 <w:color w:val="000000"/>
                 <w:sz w:val="22"/>
               </w:rPr>
-              <w:t>EudraLex Vol. 4, Annex 11 (Computerised Systems, 2011) — софтвер за преземање на податоците од USB логерите; Part I Chapter 4 (документација).</w:t>
+              <w:t>EudraLex Vol. 4, Annex 11 (Computerised Systems, 2011) — софтвер за преземање на податоците од USB логерите; Part I Chapter 4 (документација) и Chapter 7 (аутсорсирани активности — превозник).</w:t>
             </w:r>
           </w:p>
         </w:tc>
@@ -1899,7 +1957,7 @@
                 <w:color w:val="595959"/>
                 <w:sz w:val="22"/>
               </w:rPr>
-              <w:t>EudraLex Vol. 4, Annex 11 (Computerised Systems, 2011) — software for downloading the USB logger data; Part I Chapter 4 (documentation).</w:t>
+              <w:t>EudraLex Vol. 4, Annex 11 (Computerised Systems, 2011) — software for downloading the USB logger data; Part I Chapter 4 (documentation) and Chapter 7 (outsourced activities — carrier).</w:t>
             </w:r>
           </w:p>
         </w:tc>
@@ -4499,7 +4557,7 @@
                 <w:color w:val="000000"/>
                 <w:sz w:val="22"/>
               </w:rPr>
-              <w:t>6.9.2 Реквалификација: годишно (сезонско PQ — една летна и една зимска пратка) и вонредно при: промена на возилото или уредот за контрола на температура; промена на конфигурацијата на палети, картоните, стреч-фолијата или термо-ќебињата; промена на рутата или максималното времетраење; потврдена екскурзија со непозната причина; негативен тренд. Обемот (целосна OQ+PQ или само PQ) го одредува QA со процена на ризик преку контрола на промени.</w:t>
+              <w:t>6.9.2 Реквалификација: годишно (сезонско PQ — една летна и една зимска пратка) и вонредно при: промена на превозникот, возилото или уредот за контрола на температура; промена на конфигурацијата на палети, картоните, стреч-фолијата или термо-ќебињата; промена на рутата или максималното времетраење; потврдена екскурзија со непозната причина; негативен тренд. Обемот (целосна OQ+PQ или само PQ) го одредува QA со процена на ризик преку контрола на промени.</w:t>
             </w:r>
           </w:p>
         </w:tc>
@@ -4527,7 +4585,7 @@
                 <w:color w:val="595959"/>
                 <w:sz w:val="22"/>
               </w:rPr>
-              <w:t>6.9.2 Requalification: annually (seasonal PQ — one summer and one winter shipment) and additionally upon: change of vehicle or temperature-control unit; change of pallet configuration, cartons, stretch film or thermal blankets; change of route or maximum duration; a confirmed excursion of unknown cause; an adverse trend. The scope (full OQ+PQ or PQ only) is set by QA through risk assessment under change control.</w:t>
+              <w:t>6.9.2 Requalification: annually (seasonal PQ — one summer and one winter shipment) and additionally upon: change of carrier, vehicle or temperature-control unit; change of pallet configuration, cartons, stretch film or thermal blankets; change of route or maximum duration; a confirmed excursion of unknown cause; an adverse trend. The scope (full OQ+PQ or PQ only) is set by QA through risk assessment under change control.</w:t>
             </w:r>
           </w:p>
         </w:tc>

</xml_diff>

<commit_message>
QASOP_0XX: USP <1079.2> in plain brackets
The reference used U+27E8/U+27E9, which Calibri cannot render; the real glyph
guard caught it. Rebuilt the SOP PDF, the QASOP set and the final-package copy.

Co-Authored-By: Claude Opus 5.5 <noreply@anthropic.com>
Claude-Session: https://claude.ai/code/session_01Fszd7nMMPhqDmBiyiM2Bec
</commit_message>
<xml_diff>
--- a/deliverables/inland_transport_2026-10/docx/QASOP_0XX.docx
+++ b/deliverables/inland_transport_2026-10/docx/QASOP_0XX.docx
@@ -2103,7 +2103,7 @@
                 <w:color w:val="000000"/>
                 <w:sz w:val="22"/>
               </w:rPr>
-              <w:t>ICH Q9(R1) Quality Risk Management (2023); ICH Q10 Pharmaceutical Quality System (2008); USP ⟨1079.2⟩ Mean Kinetic Temperature; Ph. Eur. Монографија 3028 (Cannabis flos).</w:t>
+              <w:t>ICH Q9(R1) Quality Risk Management (2023); ICH Q10 Pharmaceutical Quality System (2008); USP &lt;1079.2&gt; Mean Kinetic Temperature; Ph. Eur. Монографија 3028 (Cannabis flos).</w:t>
             </w:r>
           </w:p>
         </w:tc>
@@ -2131,7 +2131,7 @@
                 <w:color w:val="595959"/>
                 <w:sz w:val="22"/>
               </w:rPr>
-              <w:t>ICH Q9(R1) Quality Risk Management (2023); ICH Q10 Pharmaceutical Quality System (2008); USP ⟨1079.2⟩ Mean Kinetic Temperature; Ph. Eur. Monograph 3028 (Cannabis flos).</w:t>
+              <w:t>ICH Q9(R1) Quality Risk Management (2023); ICH Q10 Pharmaceutical Quality System (2008); USP &lt;1079.2&gt; Mean Kinetic Temperature; Ph. Eur. Monograph 3028 (Cannabis flos).</w:t>
             </w:r>
           </w:p>
         </w:tc>

</xml_diff>